<commit_message>
Sync 2026-05-lun. 18 1314
</commit_message>
<xml_diff>
--- a/apipersonal/src/templates/cedula.docx
+++ b/apipersonal/src/templates/cedula.docx
@@ -194,7 +194,7 @@
           <w:b w:val="0"/>
           <w:sz w:val="22"/>
         </w:rPr>
-        <w:t>ARTICULO 1º. ART1TEXT</w:t>
+        <w:t>ART1FULL</w:t>
       </w:r>
     </w:p>
     <w:p>
@@ -207,7 +207,59 @@
           <w:b w:val="0"/>
           <w:sz w:val="22"/>
         </w:rPr>
-        <w:t>ARTICULO 2º. ART2TEXT</w:t>
+        <w:t>ART2FULL</w:t>
+      </w:r>
+    </w:p>
+    <w:p>
+      <w:pPr>
+        <w:spacing w:before="0" w:after="80"/>
+        <w:jc w:val="left"/>
+      </w:pPr>
+      <w:r>
+        <w:rPr>
+          <w:b w:val="0"/>
+          <w:sz w:val="22"/>
+        </w:rPr>
+        <w:t>ART3FULL</w:t>
+      </w:r>
+    </w:p>
+    <w:p>
+      <w:pPr>
+        <w:spacing w:before="0" w:after="80"/>
+        <w:jc w:val="left"/>
+      </w:pPr>
+      <w:r>
+        <w:rPr>
+          <w:b w:val="0"/>
+          <w:sz w:val="22"/>
+        </w:rPr>
+        <w:t>ART4FULL</w:t>
+      </w:r>
+    </w:p>
+    <w:p>
+      <w:pPr>
+        <w:spacing w:before="0" w:after="80"/>
+        <w:jc w:val="left"/>
+      </w:pPr>
+      <w:r>
+        <w:rPr>
+          <w:b w:val="0"/>
+          <w:sz w:val="22"/>
+        </w:rPr>
+        <w:t>ART5FULL</w:t>
+      </w:r>
+    </w:p>
+    <w:p>
+      <w:pPr>
+        <w:spacing w:before="0" w:after="80"/>
+        <w:jc w:val="left"/>
+      </w:pPr>
+      <w:r>
+        <w:rPr>
+          <w:b w:val="0"/>
+          <w:sz w:val="22"/>
+        </w:rPr>
+        <w:t>ART6FULL</w:t>
       </w:r>
     </w:p>
     <w:p>
@@ -220,7 +272,7 @@
           <w:b w:val="0"/>
           <w:sz w:val="22"/>
         </w:rPr>
-        <w:t>ARTICULO 3º. ART3TEXT</w:t>
+        <w:t>ART7FULL</w:t>
       </w:r>
     </w:p>
     <w:p>

</xml_diff>